<commit_message>
Assume missing Arabic mark for student 33
Co-Authored-By: Claude Opus 5.5 <noreply@anthropic.com>
Claude-Session: https://claude.ai/code/session_01RMhryHPfNFDExGGt7U9BQZ
</commit_message>
<xml_diff>
--- a/out/تحليل_النتائج.docx
+++ b/out/تحليل_النتائج.docx
@@ -299,7 +299,7 @@
                 <w:szCs w:val="26"/>
                 <w:rtl/>
               </w:rPr>
-              <w:t xml:space="preserve">36</w:t>
+              <w:t xml:space="preserve">37</w:t>
             </w:r>
           </w:p>
         </w:tc>
@@ -374,7 +374,7 @@
                 <w:szCs w:val="26"/>
                 <w:rtl/>
               </w:rPr>
-              <w:t xml:space="preserve">1</w:t>
+              <w:t xml:space="preserve">0</w:t>
             </w:r>
           </w:p>
         </w:tc>
@@ -449,7 +449,7 @@
                 <w:szCs w:val="26"/>
                 <w:rtl/>
               </w:rPr>
-              <w:t xml:space="preserve">36</w:t>
+              <w:t xml:space="preserve">37</w:t>
             </w:r>
           </w:p>
         </w:tc>
@@ -899,7 +899,7 @@
                 <w:szCs w:val="26"/>
                 <w:rtl/>
               </w:rPr>
-              <w:t xml:space="preserve">21.42</w:t>
+              <w:t xml:space="preserve">21.43</w:t>
             </w:r>
           </w:p>
         </w:tc>
@@ -1611,41 +1611,41 @@
                 <w:szCs w:val="26"/>
                 <w:rtl/>
               </w:rPr>
-              <w:t xml:space="preserve">10</w:t>
-            </w:r>
-          </w:p>
-        </w:tc>
-        <w:tc>
-          <w:tcPr>
-            <w:tcW w:type="dxa" w:w="2400"/>
-            <w:tcBorders>
-              <w:top w:val="single" w:color="1F3864" w:sz="6"/>
-              <w:left w:val="single" w:color="1F3864" w:sz="6"/>
-              <w:bottom w:val="single" w:color="1F3864" w:sz="6"/>
-              <w:right w:val="single" w:color="1F3864" w:sz="6"/>
-            </w:tcBorders>
-            <w:tcMar>
-              <w:top w:type="dxa" w:w="90"/>
-              <w:left w:type="dxa" w:w="100"/>
-              <w:bottom w:type="dxa" w:w="90"/>
-              <w:right w:type="dxa" w:w="100"/>
-            </w:tcMar>
-            <w:vAlign w:val="center"/>
-          </w:tcPr>
-          <w:p>
-            <w:pPr>
-              <w:bidi/>
-              <w:spacing w:after="0" w:before="0"/>
-              <w:jc w:val="center"/>
-            </w:pPr>
-            <w:r>
-              <w:rPr>
-                <w:rFonts w:ascii="Arial" w:cs="Arial" w:eastAsia="Arial" w:hAnsi="Arial"/>
-                <w:sz w:val="26"/>
-                <w:szCs w:val="26"/>
-                <w:rtl/>
-              </w:rPr>
-              <w:t xml:space="preserve">225</w:t>
+              <w:t xml:space="preserve">11</w:t>
+            </w:r>
+          </w:p>
+        </w:tc>
+        <w:tc>
+          <w:tcPr>
+            <w:tcW w:type="dxa" w:w="2400"/>
+            <w:tcBorders>
+              <w:top w:val="single" w:color="1F3864" w:sz="6"/>
+              <w:left w:val="single" w:color="1F3864" w:sz="6"/>
+              <w:bottom w:val="single" w:color="1F3864" w:sz="6"/>
+              <w:right w:val="single" w:color="1F3864" w:sz="6"/>
+            </w:tcBorders>
+            <w:tcMar>
+              <w:top w:type="dxa" w:w="90"/>
+              <w:left w:type="dxa" w:w="100"/>
+              <w:bottom w:type="dxa" w:w="90"/>
+              <w:right w:type="dxa" w:w="100"/>
+            </w:tcMar>
+            <w:vAlign w:val="center"/>
+          </w:tcPr>
+          <w:p>
+            <w:pPr>
+              <w:bidi/>
+              <w:spacing w:after="0" w:before="0"/>
+              <w:jc w:val="center"/>
+            </w:pPr>
+            <w:r>
+              <w:rPr>
+                <w:rFonts w:ascii="Arial" w:cs="Arial" w:eastAsia="Arial" w:hAnsi="Arial"/>
+                <w:sz w:val="26"/>
+                <w:szCs w:val="26"/>
+                <w:rtl/>
+              </w:rPr>
+              <w:t xml:space="preserve">247.5</w:t>
             </w:r>
           </w:p>
         </w:tc>
@@ -1857,7 +1857,7 @@
                 <w:szCs w:val="26"/>
                 <w:rtl/>
               </w:rPr>
-              <w:t xml:space="preserve">36</w:t>
+              <w:t xml:space="preserve">37</w:t>
             </w:r>
           </w:p>
         </w:tc>
@@ -1894,7 +1894,7 @@
                 <w:szCs w:val="26"/>
                 <w:rtl/>
               </w:rPr>
-              <w:t xml:space="preserve">772</w:t>
+              <w:t xml:space="preserve">794.5</w:t>
             </w:r>
           </w:p>
         </w:tc>
@@ -1913,7 +1913,7 @@
           <w:szCs w:val="24"/>
           <w:rtl/>
         </w:rPr>
-        <w:t xml:space="preserve">المتوسط الحسابي من الجدول التكراري = 772 ÷ 36 = 21.44</w:t>
+        <w:t xml:space="preserve">المتوسط الحسابي من الجدول التكراري = 794.5 ÷ 37 = 21.47</w:t>
       </w:r>
     </w:p>
     <w:p>

</xml_diff>